<commit_message>
Replace branded docx templates with plain unbranded versions
</commit_message>
<xml_diff>
--- a/LeakGuard-Owner-Email-Template-EN.docx
+++ b/LeakGuard-Owner-Email-Template-EN.docx
@@ -4,28 +4,12 @@
   <w:body>
     <w:p>
       <w:pPr>
-        <w:spacing w:after="100"/>
-      </w:pPr>
-      <w:r>
-        <w:rPr>
-          <w:rFonts w:ascii="Arial" w:cs="Arial" w:eastAsia="Arial" w:hAnsi="Arial"/>
-          <w:b/>
-          <w:bCs/>
-          <w:color w:val="F7951D"/>
-          <w:sz w:val="36"/>
-          <w:szCs w:val="36"/>
-        </w:rPr>
-        <w:t xml:space="preserve">LeakGuard</w:t>
-      </w:r>
-    </w:p>
-    <w:p>
-      <w:pPr>
-        <w:spacing w:after="60"/>
-      </w:pPr>
-      <w:r>
-        <w:rPr>
-          <w:rFonts w:ascii="Arial" w:cs="Arial" w:eastAsia="Arial" w:hAnsi="Arial"/>
-          <w:color w:val="666666"/>
+        <w:spacing w:after="200"/>
+      </w:pPr>
+      <w:r>
+        <w:rPr>
+          <w:b/>
+          <w:bCs/>
           <w:sz w:val="28"/>
           <w:szCs w:val="28"/>
         </w:rPr>
@@ -34,9 +18,6 @@
     </w:p>
     <w:p>
       <w:pPr>
-        <w:pBdr>
-          <w:bottom w:val="single" w:color="F7951D" w:sz="6" w:space="8"/>
-        </w:pBdr>
         <w:spacing w:after="300"/>
       </w:pPr>
       <w:r>
@@ -44,18 +25,20 @@
           <w:i/>
           <w:iCs/>
           <w:color w:val="888888"/>
-          <w:sz w:val="20"/>
-          <w:szCs w:val="20"/>
-        </w:rPr>
-        <w:t xml:space="preserve">Personalise the highlighted fields below, then copy and send to your property owners.</w:t>
-      </w:r>
-    </w:p>
-    <w:p>
-      <w:pPr>
-        <w:pStyle w:val="Heading2"/>
-      </w:pPr>
-      <w:r>
-        <w:t xml:space="preserve">Subject Line Options</w:t>
+        </w:rPr>
+        <w:t xml:space="preserve">Personalise the highlighted fields, then copy and send to your property owners.</w:t>
+      </w:r>
+    </w:p>
+    <w:p>
+      <w:pPr>
+        <w:spacing w:after="120"/>
+      </w:pPr>
+      <w:r>
+        <w:rPr>
+          <w:b/>
+          <w:bCs/>
+        </w:rPr>
+        <w:t xml:space="preserve">Subject line options:</w:t>
       </w:r>
     </w:p>
     <w:p>
@@ -91,7 +74,7 @@
           <w:ilvl w:val="0"/>
           <w:numId w:val="2"/>
         </w:numPr>
-        <w:spacing w:after="200"/>
+        <w:spacing w:after="240"/>
       </w:pPr>
       <w:r>
         <w:t xml:space="preserve">Water monitoring for your villa — something worth knowing about</w:t>
@@ -106,8 +89,6 @@
       </w:r>
       <w:r>
         <w:rPr>
-          <w:b/>
-          <w:bCs/>
           <w:highlight w:val="yellow"/>
           <w:highlightCs w:val="yellow"/>
         </w:rPr>
@@ -127,9 +108,13 @@
     </w:p>
     <w:p>
       <w:pPr>
-        <w:pStyle w:val="Heading1"/>
-      </w:pPr>
-      <w:r>
+        <w:spacing w:after="120"/>
+      </w:pPr>
+      <w:r>
+        <w:rPr>
+          <w:b/>
+          <w:bCs/>
+        </w:rPr>
         <w:t xml:space="preserve">The problem we all face</w:t>
       </w:r>
     </w:p>
@@ -159,10 +144,14 @@
     </w:p>
     <w:p>
       <w:pPr>
-        <w:pStyle w:val="Heading1"/>
-      </w:pPr>
-      <w:r>
-        <w:t xml:space="preserve">Something we’ve been looking into</w:t>
+        <w:spacing w:after="120"/>
+      </w:pPr>
+      <w:r>
+        <w:rPr>
+          <w:b/>
+          <w:bCs/>
+        </w:rPr>
+        <w:t xml:space="preserve">Something we’re working on</w:t>
       </w:r>
     </w:p>
     <w:p>
@@ -175,9 +164,13 @@
     </w:p>
     <w:p>
       <w:pPr>
-        <w:pStyle w:val="Heading2"/>
-      </w:pPr>
-      <w:r>
+        <w:spacing w:after="120"/>
+      </w:pPr>
+      <w:r>
+        <w:rPr>
+          <w:b/>
+          <w:bCs/>
+        </w:rPr>
         <w:t xml:space="preserve">How it works:</w:t>
       </w:r>
     </w:p>
@@ -248,9 +241,13 @@
     </w:p>
     <w:p>
       <w:pPr>
-        <w:pStyle w:val="Heading2"/>
-      </w:pPr>
-      <w:r>
+        <w:spacing w:after="120"/>
+      </w:pPr>
+      <w:r>
+        <w:rPr>
+          <w:b/>
+          <w:bCs/>
+        </w:rPr>
         <w:t xml:space="preserve">What you can actually monitor:</w:t>
       </w:r>
     </w:p>
@@ -264,9 +261,13 @@
     </w:p>
     <w:p>
       <w:pPr>
-        <w:pStyle w:val="Heading2"/>
-      </w:pPr>
-      <w:r>
+        <w:spacing w:after="120"/>
+      </w:pPr>
+      <w:r>
+        <w:rPr>
+          <w:b/>
+          <w:bCs/>
+        </w:rPr>
         <w:t xml:space="preserve">The cost:</w:t>
       </w:r>
     </w:p>
@@ -298,9 +299,13 @@
     </w:p>
     <w:p>
       <w:pPr>
-        <w:pStyle w:val="Heading2"/>
-      </w:pPr>
-      <w:r>
+        <w:spacing w:after="120"/>
+      </w:pPr>
+      <w:r>
+        <w:rPr>
+          <w:b/>
+          <w:bCs/>
+        </w:rPr>
         <w:t xml:space="preserve">No commitment to register:</w:t>
       </w:r>
     </w:p>
@@ -314,9 +319,13 @@
     </w:p>
     <w:p>
       <w:pPr>
-        <w:pStyle w:val="Heading1"/>
-      </w:pPr>
-      <w:r>
+        <w:spacing w:after="120"/>
+      </w:pPr>
+      <w:r>
+        <w:rPr>
+          <w:b/>
+          <w:bCs/>
+        </w:rPr>
         <w:t xml:space="preserve">How to register</w:t>
       </w:r>
     </w:p>
@@ -331,16 +340,13 @@
     <w:p>
       <w:pPr>
         <w:spacing w:after="120"/>
-        <w:jc w:val="center"/>
-      </w:pPr>
-      <w:hyperlink w:history="1" r:id="rIdvtawoxtrc2ncwv35rdgvt">
+      </w:pPr>
+      <w:hyperlink w:history="1" r:id="rIdak3_9mzrhm1mbl1kimzyj">
         <w:r>
           <w:rPr>
             <w:rStyle w:val="Hyperlink"/>
             <w:b/>
             <w:bCs/>
-            <w:sz w:val="26"/>
-            <w:szCs w:val="26"/>
           </w:rPr>
           <w:t xml:space="preserve">leakguardlanzarote.com</w:t>
         </w:r>
@@ -370,8 +376,6 @@
       </w:r>
       <w:r>
         <w:rPr>
-          <w:b/>
-          <w:bCs/>
           <w:highlight w:val="yellow"/>
           <w:highlightCs w:val="yellow"/>
         </w:rPr>
@@ -383,9 +387,13 @@
     </w:p>
     <w:p>
       <w:pPr>
-        <w:pStyle w:val="Heading1"/>
-      </w:pPr>
-      <w:r>
+        <w:spacing w:after="120"/>
+      </w:pPr>
+      <w:r>
+        <w:rPr>
+          <w:b/>
+          <w:bCs/>
+        </w:rPr>
         <w:t xml:space="preserve">Why I’m recommending this</w:t>
       </w:r>
     </w:p>
@@ -419,12 +427,10 @@
       </w:pPr>
       <w:r>
         <w:rPr>
-          <w:b/>
-          <w:bCs/>
           <w:highlight w:val="yellow"/>
           <w:highlightCs w:val="yellow"/>
         </w:rPr>
-        <w:t xml:space="preserve">[Villa Manager Name]</w:t>
+        <w:t xml:space="preserve">[Your Name]</w:t>
       </w:r>
     </w:p>
     <w:p>
@@ -436,7 +442,7 @@
           <w:highlight w:val="yellow"/>
           <w:highlightCs w:val="yellow"/>
         </w:rPr>
-        <w:t xml:space="preserve">[Villa Management Company]</w:t>
+        <w:t xml:space="preserve">[Your Company]</w:t>
       </w:r>
     </w:p>
     <w:p>
@@ -445,7 +451,7 @@
           <w:highlight w:val="yellow"/>
           <w:highlightCs w:val="yellow"/>
         </w:rPr>
-        <w:t xml:space="preserve">[Contact details]</w:t>
+        <w:t xml:space="preserve">[Your Contact Details]</w:t>
       </w:r>
     </w:p>
     <w:sectPr>
@@ -655,7 +661,6 @@
     <w:rPrDefault>
       <w:rPr>
         <w:rFonts w:ascii="Arial" w:cs="Arial" w:eastAsia="Arial" w:hAnsi="Arial"/>
-        <w:color w:val="333333"/>
         <w:sz w:val="22"/>
         <w:szCs w:val="22"/>
       </w:rPr>
@@ -833,41 +838,5 @@
       <w:szCs w:val="20"/>
     </w:rPr>
   </w:style>
-  <w:style w:type="paragraph" w:styleId="Heading1">
-    <w:name w:val="Heading 1"/>
-    <w:basedOn w:val="Normal"/>
-    <w:next w:val="Normal"/>
-    <w:qFormat/>
-    <w:pPr>
-      <w:spacing w:after="200" w:before="300"/>
-      <w:outlineLvl w:val="0"/>
-    </w:pPr>
-    <w:rPr>
-      <w:rFonts w:ascii="Arial" w:cs="Arial" w:eastAsia="Arial" w:hAnsi="Arial"/>
-      <w:b/>
-      <w:bCs/>
-      <w:color w:val="F7951D"/>
-      <w:sz w:val="28"/>
-      <w:szCs w:val="28"/>
-    </w:rPr>
-  </w:style>
-  <w:style w:type="paragraph" w:styleId="Heading2">
-    <w:name w:val="Heading 2"/>
-    <w:basedOn w:val="Normal"/>
-    <w:next w:val="Normal"/>
-    <w:qFormat/>
-    <w:pPr>
-      <w:spacing w:after="120" w:before="240"/>
-      <w:outlineLvl w:val="1"/>
-    </w:pPr>
-    <w:rPr>
-      <w:rFonts w:ascii="Arial" w:cs="Arial" w:eastAsia="Arial" w:hAnsi="Arial"/>
-      <w:b/>
-      <w:bCs/>
-      <w:color w:val="1A1A1A"/>
-      <w:sz w:val="24"/>
-      <w:szCs w:val="24"/>
-    </w:rPr>
-  </w:style>
 </w:styles>
 </file>
</xml_diff>